<commit_message>
Working completed on NFC Based Passport Reader all working
</commit_message>
<xml_diff>
--- a/Research Doc/Research_Near_Field_Communication_Day_26_Feb_V2.docx
+++ b/Research Doc/Research_Near_Field_Communication_Day_26_Feb_V2.docx
@@ -621,6 +621,138 @@
           </w:p>
         </w:tc>
       </w:tr>
+      <w:tr>
+        <w:tc>
+          <w:tcPr>
+            <w:tcW w:w="1380" w:type="dxa"/>
+            <w:tcBorders>
+              <w:top w:val="single" w:sz="8" w:space="0" w:color="000000" w:themeColor="text1"/>
+              <w:left w:val="single" w:sz="8" w:space="0" w:color="000000" w:themeColor="text1"/>
+              <w:bottom w:val="single" w:sz="8" w:space="0" w:color="000000" w:themeColor="text1"/>
+              <w:right w:val="single" w:sz="8" w:space="0" w:color="000000" w:themeColor="text1"/>
+            </w:tcBorders>
+            <w:tcMar>
+              <w:top w:w="100" w:type="dxa"/>
+              <w:left w:w="100" w:type="dxa"/>
+              <w:bottom w:w="100" w:type="dxa"/>
+              <w:right w:w="100" w:type="dxa"/>
+            </w:tcMar>
+          </w:tcPr>
+          <w:p>
+            <w:pPr>
+              <w:spacing w:after="240" w:line="240" w:lineRule="auto"/>
+              <w:rPr>
+                <w:rFonts w:eastAsia="Times New Roman" w:cstheme="minorHAnsi"/>
+                <w:color w:val="000000" w:themeColor="text1"/>
+              </w:rPr>
+            </w:pPr>
+            <w:r>
+              <w:rPr>
+                <w:rFonts w:eastAsia="Times New Roman" w:cstheme="minorHAnsi"/>
+                <w:color w:val="000000" w:themeColor="text1"/>
+              </w:rPr>
+              <w:t>3.0</w:t>
+            </w:r>
+          </w:p>
+        </w:tc>
+        <w:tc>
+          <w:tcPr>
+            <w:tcW w:w="3740" w:type="dxa"/>
+            <w:tcBorders>
+              <w:top w:val="single" w:sz="8" w:space="0" w:color="000000" w:themeColor="text1"/>
+              <w:left w:val="single" w:sz="8" w:space="0" w:color="000000" w:themeColor="text1"/>
+              <w:bottom w:val="single" w:sz="8" w:space="0" w:color="000000" w:themeColor="text1"/>
+              <w:right w:val="single" w:sz="8" w:space="0" w:color="000000" w:themeColor="text1"/>
+            </w:tcBorders>
+            <w:tcMar>
+              <w:top w:w="100" w:type="dxa"/>
+              <w:left w:w="100" w:type="dxa"/>
+              <w:bottom w:w="100" w:type="dxa"/>
+              <w:right w:w="100" w:type="dxa"/>
+            </w:tcMar>
+          </w:tcPr>
+          <w:p>
+            <w:pPr>
+              <w:spacing w:after="240" w:line="240" w:lineRule="auto"/>
+              <w:rPr>
+                <w:rFonts w:eastAsia="Times New Roman" w:cstheme="minorHAnsi"/>
+                <w:color w:val="000000" w:themeColor="text1"/>
+              </w:rPr>
+            </w:pPr>
+            <w:r>
+              <w:rPr>
+                <w:rFonts w:eastAsia="Times New Roman" w:cstheme="minorHAnsi"/>
+                <w:color w:val="000000" w:themeColor="text1"/>
+              </w:rPr>
+              <w:t>Real Passive Authentication (ASN.1/CMS parsing + DG hash verification); Chip Authentication attempt via DG14 ECDH; document corrections</w:t>
+            </w:r>
+          </w:p>
+        </w:tc>
+        <w:tc>
+          <w:tcPr>
+            <w:tcW w:w="2340" w:type="dxa"/>
+            <w:tcBorders>
+              <w:top w:val="single" w:sz="8" w:space="0" w:color="000000" w:themeColor="text1"/>
+              <w:left w:val="single" w:sz="8" w:space="0" w:color="000000" w:themeColor="text1"/>
+              <w:bottom w:val="single" w:sz="8" w:space="0" w:color="000000" w:themeColor="text1"/>
+              <w:right w:val="single" w:sz="8" w:space="0" w:color="000000" w:themeColor="text1"/>
+            </w:tcBorders>
+            <w:tcMar>
+              <w:top w:w="100" w:type="dxa"/>
+              <w:left w:w="100" w:type="dxa"/>
+              <w:bottom w:w="100" w:type="dxa"/>
+              <w:right w:w="100" w:type="dxa"/>
+            </w:tcMar>
+          </w:tcPr>
+          <w:p>
+            <w:pPr>
+              <w:spacing w:after="240" w:line="240" w:lineRule="auto"/>
+              <w:rPr>
+                <w:rFonts w:eastAsia="Times New Roman" w:cstheme="minorHAnsi"/>
+                <w:color w:val="000000" w:themeColor="text1"/>
+              </w:rPr>
+            </w:pPr>
+            <w:r>
+              <w:rPr>
+                <w:rFonts w:eastAsia="Times New Roman" w:cstheme="minorHAnsi"/>
+                <w:color w:val="000000" w:themeColor="text1"/>
+              </w:rPr>
+              <w:t>Didar Ali</w:t>
+            </w:r>
+          </w:p>
+        </w:tc>
+        <w:tc>
+          <w:tcPr>
+            <w:tcW w:w="1620" w:type="dxa"/>
+            <w:tcBorders>
+              <w:top w:val="single" w:sz="8" w:space="0" w:color="000000" w:themeColor="text1"/>
+              <w:left w:val="single" w:sz="8" w:space="0" w:color="000000" w:themeColor="text1"/>
+              <w:bottom w:val="single" w:sz="8" w:space="0" w:color="000000" w:themeColor="text1"/>
+              <w:right w:val="single" w:sz="8" w:space="0" w:color="000000" w:themeColor="text1"/>
+            </w:tcBorders>
+            <w:tcMar>
+              <w:top w:w="100" w:type="dxa"/>
+              <w:left w:w="100" w:type="dxa"/>
+              <w:bottom w:w="100" w:type="dxa"/>
+              <w:right w:w="100" w:type="dxa"/>
+            </w:tcMar>
+          </w:tcPr>
+          <w:p>
+            <w:pPr>
+              <w:spacing w:after="240" w:line="240" w:lineRule="auto"/>
+              <w:rPr>
+                <w:rFonts w:cstheme="minorHAnsi"/>
+              </w:rPr>
+            </w:pPr>
+            <w:r>
+              <w:rPr>
+                <w:rFonts w:cstheme="minorHAnsi"/>
+              </w:rPr>
+              <w:t>27 Feb 2026</w:t>
+            </w:r>
+          </w:p>
+        </w:tc>
+      </w:tr>
     </w:tbl>
     <w:p>
       <w:pPr>
@@ -7019,7 +7151,6 @@
           <w:bCs/>
           <w:szCs w:val="24"/>
         </w:rPr>
-        <w:lastRenderedPageBreak/>
         <w:t>Power transfer to passive devices:</w:t>
       </w:r>
       <w:r>
@@ -7817,7 +7948,6 @@
           <w:rFonts w:eastAsia="Calibri" w:cstheme="minorHAnsi"/>
           <w:szCs w:val="24"/>
         </w:rPr>
-        <w:lastRenderedPageBreak/>
         <w:t>Smartphones can also store secure credentials in their Secure Element (SE) or embedded storage, which is independent of the NFC physical layer</w:t>
       </w:r>
     </w:p>
@@ -8204,7 +8334,6 @@
           <w:rFonts w:eastAsia="Calibri" w:cstheme="minorHAnsi"/>
           <w:szCs w:val="24"/>
         </w:rPr>
-        <w:lastRenderedPageBreak/>
         <w:t>NFC employs encryption keys to secure data communication, ensuring that sensitive information is accessible only to authorized entities during transactions or data exchange.</w:t>
       </w:r>
     </w:p>
@@ -8518,7 +8647,6 @@
           <w:bCs/>
           <w:szCs w:val="24"/>
         </w:rPr>
-        <w:lastRenderedPageBreak/>
         <w:t>Enhanced Security:</w:t>
       </w:r>
       <w:r>
@@ -8943,7 +9071,6 @@
           <w:b w:val="0"/>
           <w:bCs w:val="0"/>
         </w:rPr>
-        <w:lastRenderedPageBreak/>
         <w:t>Terminologies</w:t>
       </w:r>
       <w:bookmarkEnd w:id="40"/>
@@ -9595,7 +9722,6 @@
                 <w:bCs/>
                 <w:szCs w:val="24"/>
               </w:rPr>
-              <w:lastRenderedPageBreak/>
               <w:t>DG</w:t>
             </w:r>
           </w:p>
@@ -10886,7 +11012,7 @@
           <w:szCs w:val="24"/>
         </w:rPr>
         <w:pict w14:anchorId="594CB4A6">
-          <v:rect id="_x0000_i1025" style="width:0;height:1.5pt" o:hralign="center" o:hrstd="t" o:hr="t" fillcolor="#a0a0a0" stroked="f"/>
+          <v:rect id="_x0000_i1030" style="width:0;height:1.5pt" o:hralign="center" o:hrstd="t" o:hr="t" fillcolor="#a0a0a0" stroked="f"/>
         </w:pict>
       </w:r>
     </w:p>
@@ -10994,7 +11120,6 @@
                 <w:bCs/>
                 <w:szCs w:val="24"/>
               </w:rPr>
-              <w:lastRenderedPageBreak/>
               <w:t>DG</w:t>
             </w:r>
           </w:p>
@@ -11764,7 +11889,6 @@
           <w:bCs/>
           <w:szCs w:val="24"/>
         </w:rPr>
-        <w:lastRenderedPageBreak/>
         <w:t>1: N Matching:</w:t>
       </w:r>
       <w:r>
@@ -12407,7 +12531,6 @@
           <w:b w:val="0"/>
           <w:bCs w:val="0"/>
         </w:rPr>
-        <w:lastRenderedPageBreak/>
         <w:t>Limitations</w:t>
       </w:r>
       <w:bookmarkEnd w:id="62"/>
@@ -12661,15 +12784,7 @@
           <w:b w:val="0"/>
           <w:bCs w:val="0"/>
         </w:rPr>
-        <w:t>NFC</w:t>
-      </w:r>
-      <w:r>
-        <w:rPr>
-          <w:rFonts w:asciiTheme="minorHAnsi" w:eastAsia="Calibri" w:hAnsiTheme="minorHAnsi" w:cstheme="minorHAnsi"/>
-          <w:b w:val="0"/>
-          <w:bCs w:val="0"/>
-        </w:rPr>
-        <w:t xml:space="preserve"> </w:t>
+        <w:t xml:space="preserve">NFC </w:t>
       </w:r>
       <w:r>
         <w:rPr>
@@ -12825,7 +12940,6 @@
           <w:rFonts w:eastAsia="Calibri" w:cstheme="minorHAnsi"/>
           <w:szCs w:val="24"/>
         </w:rPr>
-        <w:lastRenderedPageBreak/>
         <w:t>NFC enables mobile wallet systems where smartphones emulate physical bank cards. Banking applications store payment credentials securely within a Secure Element (SE) or use Host Card Emulation (HCE) combined with cloud-based security.</w:t>
       </w:r>
     </w:p>
@@ -13248,7 +13362,6 @@
           <w:rFonts w:eastAsia="Calibri" w:cstheme="minorHAnsi"/>
           <w:szCs w:val="24"/>
         </w:rPr>
-        <w:lastRenderedPageBreak/>
         <w:t>NFC is used for secure access control in banking environments, including branch entry, restricted areas, and employee authentication.</w:t>
       </w:r>
     </w:p>
@@ -13628,7 +13741,6 @@
           <w:rFonts w:eastAsia="Calibri" w:cstheme="minorHAnsi"/>
           <w:szCs w:val="24"/>
         </w:rPr>
-        <w:lastRenderedPageBreak/>
         <w:t xml:space="preserve">Each transaction generates </w:t>
       </w:r>
       <w:r>
@@ -14293,7 +14405,6 @@
           <w:rFonts w:eastAsia="Calibri" w:cstheme="minorHAnsi"/>
           <w:szCs w:val="24"/>
         </w:rPr>
-        <w:lastRenderedPageBreak/>
         <w:t>Anti-collision mechanisms to prevent signal confusion</w:t>
       </w:r>
     </w:p>
@@ -15064,7 +15175,6 @@
           <w:b w:val="0"/>
           <w:bCs w:val="0"/>
         </w:rPr>
-        <w:lastRenderedPageBreak/>
         <w:t>NFC Banking Research Limitations</w:t>
       </w:r>
       <w:bookmarkEnd w:id="99"/>
@@ -15193,7 +15303,7 @@
           <w:b w:val="0"/>
           <w:bCs w:val="0"/>
         </w:rPr>
-        <w:t>Step 1 — User Consent (T&amp;C)</w:t>
+        <w:t>User Consent (T&amp;C)</w:t>
       </w:r>
       <w:bookmarkEnd w:id="102"/>
     </w:p>
@@ -15230,15 +15340,14 @@
       </w:pPr>
       <w:r>
         <w:rPr>
-          <w:rFonts w:cstheme="minorHAnsi"/>
           <w:noProof/>
         </w:rPr>
         <w:lastRenderedPageBreak/>
         <w:drawing>
-          <wp:inline distT="0" distB="0" distL="0" distR="0" wp14:anchorId="6972D13E" wp14:editId="184C7B8E">
-            <wp:extent cx="2398542" cy="4905375"/>
-            <wp:effectExtent l="0" t="0" r="1905" b="0"/>
-            <wp:docPr id="312145396" name="Picture 3"/>
+          <wp:inline distT="0" distB="0" distL="0" distR="0" wp14:anchorId="55C8AAF3" wp14:editId="4E08575E">
+            <wp:extent cx="2636853" cy="4810539"/>
+            <wp:effectExtent l="0" t="0" r="0" b="0"/>
+            <wp:docPr id="407657210" name="Picture 8"/>
             <wp:cNvGraphicFramePr>
               <a:graphicFrameLocks xmlns:a="http://schemas.openxmlformats.org/drawingml/2006/main" noChangeAspect="1"/>
             </wp:cNvGraphicFramePr>
@@ -15246,7 +15355,7 @@
               <a:graphicData uri="http://schemas.openxmlformats.org/drawingml/2006/picture">
                 <pic:pic xmlns:pic="http://schemas.openxmlformats.org/drawingml/2006/picture">
                   <pic:nvPicPr>
-                    <pic:cNvPr id="312145396" name="Picture 312145396"/>
+                    <pic:cNvPr id="407657210" name="Picture 407657210"/>
                     <pic:cNvPicPr/>
                   </pic:nvPicPr>
                   <pic:blipFill>
@@ -15264,7 +15373,7 @@
                   <pic:spPr>
                     <a:xfrm>
                       <a:off x="0" y="0"/>
-                      <a:ext cx="2398542" cy="4905375"/>
+                      <a:ext cx="2646456" cy="4828059"/>
                     </a:xfrm>
                     <a:prstGeom prst="rect">
                       <a:avLst/>
@@ -15293,7 +15402,10 @@
         </w:r>
       </w:fldSimple>
       <w:r>
-        <w:t xml:space="preserve"> The App home screen</w:t>
+        <w:t xml:space="preserve"> </w:t>
+      </w:r>
+      <w:r>
+        <w:t>The App home screen</w:t>
       </w:r>
     </w:p>
     <w:p>
@@ -15303,20 +15415,13 @@
       </w:pPr>
       <w:r>
         <w:rPr>
-          <w:rFonts w:cstheme="minorHAnsi"/>
-        </w:rPr>
-        <w:t xml:space="preserve"> </w:t>
-      </w:r>
-      <w:r>
-        <w:rPr>
-          <w:rFonts w:cstheme="minorHAnsi"/>
           <w:noProof/>
         </w:rPr>
         <w:drawing>
-          <wp:inline distT="0" distB="0" distL="0" distR="0" wp14:anchorId="374F5757" wp14:editId="13860A79">
-            <wp:extent cx="2370406" cy="4908689"/>
-            <wp:effectExtent l="0" t="0" r="0" b="6350"/>
-            <wp:docPr id="1996502778" name="Picture 4"/>
+          <wp:inline distT="0" distB="0" distL="0" distR="0" wp14:anchorId="2DAF0059" wp14:editId="67EB6ED9">
+            <wp:extent cx="2637096" cy="4746929"/>
+            <wp:effectExtent l="0" t="0" r="0" b="0"/>
+            <wp:docPr id="955213405" name="Picture 9"/>
             <wp:cNvGraphicFramePr>
               <a:graphicFrameLocks xmlns:a="http://schemas.openxmlformats.org/drawingml/2006/main" noChangeAspect="1"/>
             </wp:cNvGraphicFramePr>
@@ -15324,7 +15429,7 @@
               <a:graphicData uri="http://schemas.openxmlformats.org/drawingml/2006/picture">
                 <pic:pic xmlns:pic="http://schemas.openxmlformats.org/drawingml/2006/picture">
                   <pic:nvPicPr>
-                    <pic:cNvPr id="1996502778" name="Picture 1996502778"/>
+                    <pic:cNvPr id="955213405" name="Picture 955213405"/>
                     <pic:cNvPicPr/>
                   </pic:nvPicPr>
                   <pic:blipFill>
@@ -15342,7 +15447,7 @@
                   <pic:spPr>
                     <a:xfrm>
                       <a:off x="0" y="0"/>
-                      <a:ext cx="2380898" cy="4930415"/>
+                      <a:ext cx="2648072" cy="4766687"/>
                     </a:xfrm>
                     <a:prstGeom prst="rect">
                       <a:avLst/>
@@ -15358,9 +15463,6 @@
     <w:p>
       <w:pPr>
         <w:pStyle w:val="Caption"/>
-        <w:rPr>
-          <w:rFonts w:cstheme="minorHAnsi"/>
-        </w:rPr>
       </w:pPr>
       <w:r>
         <w:t xml:space="preserve">Figure </w:t>
@@ -15374,10 +15476,16 @@
         </w:r>
       </w:fldSimple>
       <w:r>
+        <w:rPr>
+          <w:noProof/>
+        </w:rPr>
         <w:t xml:space="preserve"> </w:t>
       </w:r>
       <w:r>
         <w:t>shows the consent screen with both toggles enabled and the four-step scan process outlined.</w:t>
+      </w:r>
+      <w:r>
+        <w:t xml:space="preserve"> </w:t>
       </w:r>
     </w:p>
     <w:p>
@@ -15419,7 +15527,7 @@
           <w:b w:val="0"/>
           <w:bCs w:val="0"/>
         </w:rPr>
-        <w:t>Step 2 — MRZ Scanning</w:t>
+        <w:t>MRZ Scanning</w:t>
       </w:r>
       <w:bookmarkEnd w:id="103"/>
     </w:p>
@@ -15485,17 +15593,18 @@
         <w:spacing w:line="240" w:lineRule="auto"/>
       </w:pPr>
       <w:r>
-        <w:rPr>
-          <w:rFonts w:cstheme="minorHAnsi"/>
-          <w:b/>
+        <w:lastRenderedPageBreak/>
+        <w:t xml:space="preserve"> </w:t>
+      </w:r>
+      <w:r>
+        <w:rPr>
           <w:noProof/>
         </w:rPr>
-        <w:lastRenderedPageBreak/>
         <w:drawing>
-          <wp:inline distT="0" distB="0" distL="0" distR="0" wp14:anchorId="7BAB890F" wp14:editId="36CB5D59">
-            <wp:extent cx="2640965" cy="4952630"/>
-            <wp:effectExtent l="0" t="0" r="6985" b="635"/>
-            <wp:docPr id="1183866940" name="Picture 5"/>
+          <wp:inline distT="0" distB="0" distL="0" distR="0" wp14:anchorId="6F483E70" wp14:editId="70B4ECC0">
+            <wp:extent cx="2655477" cy="3600671"/>
+            <wp:effectExtent l="0" t="0" r="0" b="0"/>
+            <wp:docPr id="848126689" name="Picture 7"/>
             <wp:cNvGraphicFramePr>
               <a:graphicFrameLocks xmlns:a="http://schemas.openxmlformats.org/drawingml/2006/main" noChangeAspect="1"/>
             </wp:cNvGraphicFramePr>
@@ -15503,7 +15612,7 @@
               <a:graphicData uri="http://schemas.openxmlformats.org/drawingml/2006/picture">
                 <pic:pic xmlns:pic="http://schemas.openxmlformats.org/drawingml/2006/picture">
                   <pic:nvPicPr>
-                    <pic:cNvPr id="1183866940" name="Picture 1183866940"/>
+                    <pic:cNvPr id="848126689" name="Picture 848126689"/>
                     <pic:cNvPicPr/>
                   </pic:nvPicPr>
                   <pic:blipFill>
@@ -15521,7 +15630,7 @@
                   <pic:spPr>
                     <a:xfrm>
                       <a:off x="0" y="0"/>
-                      <a:ext cx="2657071" cy="4982834"/>
+                      <a:ext cx="2669943" cy="3620286"/>
                     </a:xfrm>
                     <a:prstGeom prst="rect">
                       <a:avLst/>
@@ -15563,15 +15672,13 @@
       </w:pPr>
       <w:r>
         <w:rPr>
-          <w:rFonts w:cstheme="minorHAnsi"/>
-          <w:b/>
           <w:noProof/>
         </w:rPr>
         <w:drawing>
-          <wp:inline distT="0" distB="0" distL="0" distR="0" wp14:anchorId="2AE6EA0A" wp14:editId="0071F1FB">
-            <wp:extent cx="2983734" cy="4913453"/>
-            <wp:effectExtent l="0" t="0" r="7620" b="1905"/>
-            <wp:docPr id="1297774718" name="Picture 6"/>
+          <wp:inline distT="0" distB="0" distL="0" distR="0" wp14:anchorId="03FDF5DC" wp14:editId="01ECB3A8">
+            <wp:extent cx="2636693" cy="3848128"/>
+            <wp:effectExtent l="0" t="0" r="0" b="0"/>
+            <wp:docPr id="927040355" name="Picture 6"/>
             <wp:cNvGraphicFramePr>
               <a:graphicFrameLocks xmlns:a="http://schemas.openxmlformats.org/drawingml/2006/main" noChangeAspect="1"/>
             </wp:cNvGraphicFramePr>
@@ -15579,7 +15686,7 @@
               <a:graphicData uri="http://schemas.openxmlformats.org/drawingml/2006/picture">
                 <pic:pic xmlns:pic="http://schemas.openxmlformats.org/drawingml/2006/picture">
                   <pic:nvPicPr>
-                    <pic:cNvPr id="1297774718" name="Picture 1297774718"/>
+                    <pic:cNvPr id="927040355" name="Picture 927040355"/>
                     <pic:cNvPicPr/>
                   </pic:nvPicPr>
                   <pic:blipFill>
@@ -15597,7 +15704,7 @@
                   <pic:spPr>
                     <a:xfrm>
                       <a:off x="0" y="0"/>
-                      <a:ext cx="3017307" cy="4968739"/>
+                      <a:ext cx="2652969" cy="3871882"/>
                     </a:xfrm>
                     <a:prstGeom prst="rect">
                       <a:avLst/>
@@ -15613,10 +15720,6 @@
     <w:p>
       <w:pPr>
         <w:pStyle w:val="Caption"/>
-        <w:rPr>
-          <w:rFonts w:cstheme="minorHAnsi"/>
-          <w:b/>
-        </w:rPr>
       </w:pPr>
       <w:r>
         <w:t xml:space="preserve">Figure </w:t>
@@ -15638,14 +15741,10 @@
     </w:p>
     <w:p>
       <w:pPr>
-        <w:pStyle w:val="Heading3"/>
-        <w:numPr>
-          <w:ilvl w:val="2"/>
-          <w:numId w:val="44"/>
-        </w:numPr>
-        <w:rPr>
-          <w:b w:val="0"/>
-          <w:bCs w:val="0"/>
+        <w:pStyle w:val="Caption"/>
+        <w:rPr>
+          <w:rFonts w:cstheme="minorHAnsi"/>
+          <w:b/>
         </w:rPr>
         <w:sectPr>
           <w:type w:val="continuous"/>
@@ -15675,7 +15774,7 @@
           <w:b w:val="0"/>
           <w:bCs w:val="0"/>
         </w:rPr>
-        <w:t>Step 3 — Key Derivation (BAC Key Generation)</w:t>
+        <w:t>Key Derivation (BAC Key Generation)</w:t>
       </w:r>
       <w:bookmarkEnd w:id="104"/>
     </w:p>
@@ -15925,175 +16024,6 @@
     </w:p>
     <w:p>
       <w:pPr>
-        <w:spacing w:line="240" w:lineRule="auto"/>
-        <w:rPr>
-          <w:rFonts w:cstheme="minorHAnsi"/>
-        </w:rPr>
-      </w:pPr>
-      <w:r>
-        <w:rPr>
-          <w:rFonts w:cstheme="minorHAnsi"/>
-        </w:rPr>
-        <w:t>.</w:t>
-      </w:r>
-    </w:p>
-    <w:p>
-      <w:pPr>
-        <w:pStyle w:val="Heading3"/>
-        <w:numPr>
-          <w:ilvl w:val="2"/>
-          <w:numId w:val="44"/>
-        </w:numPr>
-        <w:rPr>
-          <w:b w:val="0"/>
-          <w:bCs w:val="0"/>
-        </w:rPr>
-      </w:pPr>
-      <w:bookmarkStart w:id="105" w:name="_Toc223028200"/>
-      <w:r>
-        <w:rPr>
-          <w:b w:val="0"/>
-          <w:bCs w:val="0"/>
-        </w:rPr>
-        <w:lastRenderedPageBreak/>
-        <w:t>Step 4 — NFC Tap and Authentication</w:t>
-      </w:r>
-      <w:bookmarkEnd w:id="105"/>
-    </w:p>
-    <w:p>
-      <w:pPr>
-        <w:spacing w:line="240" w:lineRule="auto"/>
-        <w:rPr>
-          <w:rFonts w:cstheme="minorHAnsi"/>
-        </w:rPr>
-      </w:pPr>
-      <w:r>
-        <w:rPr>
-          <w:rFonts w:cstheme="minorHAnsi"/>
-        </w:rPr>
-        <w:t>With the BAC keys derived, the application initiates the NFC session. The user places their phone (back face) against the cover of the passport and holds steady for up to 10 seconds. The authentication sequence proceeds in four stages.</w:t>
-      </w:r>
-    </w:p>
-    <w:p>
-      <w:pPr>
-        <w:pStyle w:val="ListParagraph"/>
-        <w:numPr>
-          <w:ilvl w:val="0"/>
-          <w:numId w:val="78"/>
-        </w:numPr>
-        <w:spacing w:line="240" w:lineRule="auto"/>
-        <w:rPr>
-          <w:rFonts w:cstheme="minorHAnsi"/>
-        </w:rPr>
-      </w:pPr>
-      <w:r>
-        <w:rPr>
-          <w:rFonts w:cstheme="minorHAnsi"/>
-        </w:rPr>
-        <w:t>Application Selection: App sends SELECT APDU with AID A0000002471001; chip confirms.</w:t>
-      </w:r>
-    </w:p>
-    <w:p>
-      <w:pPr>
-        <w:pStyle w:val="ListParagraph"/>
-        <w:numPr>
-          <w:ilvl w:val="0"/>
-          <w:numId w:val="78"/>
-        </w:numPr>
-        <w:spacing w:line="240" w:lineRule="auto"/>
-        <w:rPr>
-          <w:rFonts w:cstheme="minorHAnsi"/>
-        </w:rPr>
-      </w:pPr>
-      <w:r>
-        <w:rPr>
-          <w:rFonts w:cstheme="minorHAnsi"/>
-        </w:rPr>
-        <w:t>Get Challenge: App requests 8-byte nonce (RND.ICC) from chip.</w:t>
-      </w:r>
-    </w:p>
-    <w:p>
-      <w:pPr>
-        <w:pStyle w:val="ListParagraph"/>
-        <w:numPr>
-          <w:ilvl w:val="0"/>
-          <w:numId w:val="78"/>
-        </w:numPr>
-        <w:spacing w:line="240" w:lineRule="auto"/>
-        <w:rPr>
-          <w:rFonts w:cstheme="minorHAnsi"/>
-        </w:rPr>
-      </w:pPr>
-      <w:r>
-        <w:rPr>
-          <w:rFonts w:cstheme="minorHAnsi"/>
-        </w:rPr>
-        <w:t xml:space="preserve">Mutual Authentication (3DES): App generates RND.IFD, encrypts with </w:t>
-      </w:r>
-      <w:proofErr w:type="spellStart"/>
-      <w:r>
-        <w:rPr>
-          <w:rFonts w:cstheme="minorHAnsi"/>
-        </w:rPr>
-        <w:t>Kenc</w:t>
-      </w:r>
-      <w:proofErr w:type="spellEnd"/>
-      <w:r>
-        <w:rPr>
-          <w:rFonts w:cstheme="minorHAnsi"/>
-        </w:rPr>
-        <w:t>, sends EXTERNAL AUTHENTICATE; chip responds; app verifies → mutual trust established.</w:t>
-      </w:r>
-    </w:p>
-    <w:p>
-      <w:pPr>
-        <w:pStyle w:val="ListParagraph"/>
-        <w:numPr>
-          <w:ilvl w:val="0"/>
-          <w:numId w:val="78"/>
-        </w:numPr>
-        <w:spacing w:line="240" w:lineRule="auto"/>
-        <w:rPr>
-          <w:rFonts w:cstheme="minorHAnsi"/>
-        </w:rPr>
-      </w:pPr>
-      <w:r>
-        <w:rPr>
-          <w:rFonts w:cstheme="minorHAnsi"/>
-        </w:rPr>
-        <w:t>Secure Messaging: Derive session keys (</w:t>
-      </w:r>
-      <w:proofErr w:type="spellStart"/>
-      <w:r>
-        <w:rPr>
-          <w:rFonts w:cstheme="minorHAnsi"/>
-        </w:rPr>
-        <w:t>ksEnc</w:t>
-      </w:r>
-      <w:proofErr w:type="spellEnd"/>
-      <w:r>
-        <w:rPr>
-          <w:rFonts w:cstheme="minorHAnsi"/>
-        </w:rPr>
-        <w:t xml:space="preserve">, </w:t>
-      </w:r>
-      <w:proofErr w:type="spellStart"/>
-      <w:r>
-        <w:rPr>
-          <w:rFonts w:cstheme="minorHAnsi"/>
-        </w:rPr>
-        <w:t>ksMac</w:t>
-      </w:r>
-      <w:proofErr w:type="spellEnd"/>
-      <w:r>
-        <w:rPr>
-          <w:rFonts w:cstheme="minorHAnsi"/>
-        </w:rPr>
-        <w:t>) and SSC; all APDUs encrypted with 3DES + ISO 9797-1 MAC.</w:t>
-      </w:r>
-    </w:p>
-    <w:p>
-      <w:pPr>
         <w:keepNext/>
         <w:spacing w:line="240" w:lineRule="auto"/>
       </w:pPr>
@@ -16102,11 +16032,12 @@
           <w:rFonts w:cstheme="minorHAnsi"/>
           <w:noProof/>
         </w:rPr>
+        <w:lastRenderedPageBreak/>
         <w:drawing>
-          <wp:inline distT="0" distB="0" distL="0" distR="0" wp14:anchorId="4C420DD1" wp14:editId="41B2B90D">
-            <wp:extent cx="3987165" cy="4791919"/>
-            <wp:effectExtent l="0" t="0" r="0" b="8890"/>
-            <wp:docPr id="319313757" name="Picture 7"/>
+          <wp:inline distT="0" distB="0" distL="0" distR="0" wp14:anchorId="3EF914E5" wp14:editId="29677B2A">
+            <wp:extent cx="3987123" cy="4850296"/>
+            <wp:effectExtent l="0" t="0" r="0" b="7620"/>
+            <wp:docPr id="2040913427" name="Picture 10"/>
             <wp:cNvGraphicFramePr>
               <a:graphicFrameLocks xmlns:a="http://schemas.openxmlformats.org/drawingml/2006/main" noChangeAspect="1"/>
             </wp:cNvGraphicFramePr>
@@ -16114,10 +16045,10 @@
               <a:graphicData uri="http://schemas.openxmlformats.org/drawingml/2006/picture">
                 <pic:pic xmlns:pic="http://schemas.openxmlformats.org/drawingml/2006/picture">
                   <pic:nvPicPr>
-                    <pic:cNvPr id="319313757" name="Picture 319313757"/>
+                    <pic:cNvPr id="2040913427" name="Picture 2040913427"/>
                     <pic:cNvPicPr/>
                   </pic:nvPicPr>
-                  <pic:blipFill>
+                  <pic:blipFill rotWithShape="1">
                     <a:blip r:embed="rId20" cstate="print">
                       <a:extLst>
                         <a:ext uri="{28A0092B-C50C-407E-A947-70E740481C1C}">
@@ -16125,18 +16056,27 @@
                         </a:ext>
                       </a:extLst>
                     </a:blip>
+                    <a:srcRect b="16946"/>
                     <a:stretch>
                       <a:fillRect/>
                     </a:stretch>
                   </pic:blipFill>
-                  <pic:spPr>
+                  <pic:spPr bwMode="auto">
                     <a:xfrm>
                       <a:off x="0" y="0"/>
-                      <a:ext cx="4022701" cy="4834628"/>
+                      <a:ext cx="4006742" cy="4874162"/>
                     </a:xfrm>
                     <a:prstGeom prst="rect">
                       <a:avLst/>
                     </a:prstGeom>
+                    <a:ln>
+                      <a:noFill/>
+                    </a:ln>
+                    <a:extLst>
+                      <a:ext uri="{53640926-AAD7-44D8-BBD7-CCE9431645EC}">
+                        <a14:shadowObscured xmlns:a14="http://schemas.microsoft.com/office/drawing/2010/main"/>
+                      </a:ext>
+                    </a:extLst>
                   </pic:spPr>
                 </pic:pic>
               </a:graphicData>
@@ -16164,16 +16104,21 @@
         </w:r>
       </w:fldSimple>
       <w:r>
-        <w:t xml:space="preserve"> </w:t>
-      </w:r>
-      <w:r>
-        <w:t>shows the NFC Read screen with completed stages visible: e</w:t>
-      </w:r>
-      <w:r>
-        <w:t>-</w:t>
-      </w:r>
-      <w:r>
-        <w:t>MRTD app selection, BAC authentication, DG1 reading, DG2 reading, and SOD reading — with Chip Authentication (CA) in progress at step 6.</w:t>
+        <w:t xml:space="preserve"> BAC generated from MRZ</w:t>
+      </w:r>
+    </w:p>
+    <w:p>
+      <w:pPr>
+        <w:spacing w:line="240" w:lineRule="auto"/>
+        <w:rPr>
+          <w:rFonts w:cstheme="minorHAnsi"/>
+        </w:rPr>
+      </w:pPr>
+      <w:r>
+        <w:rPr>
+          <w:rFonts w:cstheme="minorHAnsi"/>
+        </w:rPr>
+        <w:t>.</w:t>
       </w:r>
     </w:p>
     <w:p>
@@ -16188,15 +16133,15 @@
           <w:bCs w:val="0"/>
         </w:rPr>
       </w:pPr>
-      <w:bookmarkStart w:id="106" w:name="_Toc223028201"/>
+      <w:bookmarkStart w:id="105" w:name="_Toc223028200"/>
       <w:r>
         <w:rPr>
           <w:b w:val="0"/>
           <w:bCs w:val="0"/>
         </w:rPr>
-        <w:t>Step 5 — Data Extraction (DG1, DG2, SOD)</w:t>
-      </w:r>
-      <w:bookmarkEnd w:id="106"/>
+        <w:t>NFC Tap and Authentication</w:t>
+      </w:r>
+      <w:bookmarkEnd w:id="105"/>
     </w:p>
     <w:p>
       <w:pPr>
@@ -16209,96 +16154,125 @@
         <w:rPr>
           <w:rFonts w:cstheme="minorHAnsi"/>
         </w:rPr>
-        <w:t>After the secure session is established, the application reads three data groups</w:t>
-      </w:r>
-      <w:r>
+        <w:t>With the BAC keys derived, the application initiates the NFC session. The user places their phone (back face) against the cover of the passport and holds steady for up to 10 seconds. The authentication sequence proceeds in four stages.</w:t>
+      </w:r>
+    </w:p>
+    <w:p>
+      <w:pPr>
+        <w:pStyle w:val="ListParagraph"/>
+        <w:numPr>
+          <w:ilvl w:val="0"/>
+          <w:numId w:val="78"/>
+        </w:numPr>
+        <w:spacing w:line="240" w:lineRule="auto"/>
         <w:rPr>
           <w:rFonts w:cstheme="minorHAnsi"/>
         </w:rPr>
-        <w:t xml:space="preserve"> </w:t>
-      </w:r>
+      </w:pPr>
       <w:r>
         <w:rPr>
           <w:rFonts w:cstheme="minorHAnsi"/>
-          <w:b/>
-          <w:bCs/>
-        </w:rPr>
-        <w:t>(DG1</w:t>
-      </w:r>
-      <w:r>
+        </w:rPr>
+        <w:t>Application Selection: App sends SELECT APDU with AID A0000002471001; chip confirms.</w:t>
+      </w:r>
+    </w:p>
+    <w:p>
+      <w:pPr>
+        <w:pStyle w:val="ListParagraph"/>
+        <w:numPr>
+          <w:ilvl w:val="0"/>
+          <w:numId w:val="78"/>
+        </w:numPr>
+        <w:spacing w:line="240" w:lineRule="auto"/>
         <w:rPr>
           <w:rFonts w:cstheme="minorHAnsi"/>
-          <w:b/>
-          <w:bCs/>
-        </w:rPr>
-        <w:t xml:space="preserve">: </w:t>
-      </w:r>
+        </w:rPr>
+      </w:pPr>
       <w:r>
         <w:rPr>
           <w:rFonts w:cstheme="minorHAnsi"/>
-          <w:b/>
-          <w:bCs/>
-        </w:rPr>
-        <w:t>Personal Data, DG2</w:t>
-      </w:r>
-      <w:r>
+        </w:rPr>
+        <w:t>Get Challenge: App requests 8-byte nonce (RND.ICC) from chip.</w:t>
+      </w:r>
+    </w:p>
+    <w:p>
+      <w:pPr>
+        <w:pStyle w:val="ListParagraph"/>
+        <w:numPr>
+          <w:ilvl w:val="0"/>
+          <w:numId w:val="78"/>
+        </w:numPr>
+        <w:spacing w:line="240" w:lineRule="auto"/>
         <w:rPr>
           <w:rFonts w:cstheme="minorHAnsi"/>
-          <w:b/>
-          <w:bCs/>
-        </w:rPr>
-        <w:t xml:space="preserve">: </w:t>
-      </w:r>
+        </w:rPr>
+      </w:pPr>
       <w:r>
         <w:rPr>
           <w:rFonts w:cstheme="minorHAnsi"/>
-          <w:b/>
-          <w:bCs/>
-        </w:rPr>
-        <w:t xml:space="preserve">Face Image </w:t>
-      </w:r>
+        </w:rPr>
+        <w:t xml:space="preserve">Mutual Authentication (3DES): App generates RND.IFD, encrypts with </w:t>
+      </w:r>
+      <w:proofErr w:type="spellStart"/>
       <w:r>
         <w:rPr>
           <w:rFonts w:cstheme="minorHAnsi"/>
         </w:rPr>
-        <w:t>and</w:t>
-      </w:r>
+        <w:t>Kenc</w:t>
+      </w:r>
+      <w:proofErr w:type="spellEnd"/>
       <w:r>
         <w:rPr>
           <w:rFonts w:cstheme="minorHAnsi"/>
-          <w:b/>
-          <w:bCs/>
-        </w:rPr>
-        <w:t xml:space="preserve"> SO</w:t>
-      </w:r>
-      <w:r>
+        </w:rPr>
+        <w:t>, sends EXTERNAL AUTHENTICATE; chip responds; app verifies → mutual trust established.</w:t>
+      </w:r>
+    </w:p>
+    <w:p>
+      <w:pPr>
+        <w:pStyle w:val="ListParagraph"/>
+        <w:numPr>
+          <w:ilvl w:val="0"/>
+          <w:numId w:val="78"/>
+        </w:numPr>
+        <w:spacing w:line="240" w:lineRule="auto"/>
         <w:rPr>
           <w:rFonts w:cstheme="minorHAnsi"/>
-          <w:b/>
-          <w:bCs/>
-        </w:rPr>
-        <w:t>D:</w:t>
-      </w:r>
+        </w:rPr>
+      </w:pPr>
       <w:r>
         <w:rPr>
           <w:rFonts w:cstheme="minorHAnsi"/>
-          <w:b/>
-          <w:bCs/>
-        </w:rPr>
-        <w:t xml:space="preserve"> Security Object Document)</w:t>
-      </w:r>
+        </w:rPr>
+        <w:t>Secure Messaging: Derive session keys (</w:t>
+      </w:r>
+      <w:proofErr w:type="spellStart"/>
       <w:r>
         <w:rPr>
           <w:rFonts w:cstheme="minorHAnsi"/>
         </w:rPr>
-        <w:t xml:space="preserve"> from the chip over </w:t>
-      </w:r>
+        <w:t>ksEnc</w:t>
+      </w:r>
+      <w:proofErr w:type="spellEnd"/>
       <w:r>
         <w:rPr>
           <w:rFonts w:cstheme="minorHAnsi"/>
         </w:rPr>
-        <w:lastRenderedPageBreak/>
-        <w:t>the encrypted channel, using 224-byte chunks via sequential READ BINARY APDU commands.</w:t>
+        <w:t xml:space="preserve">, </w:t>
+      </w:r>
+      <w:proofErr w:type="spellStart"/>
+      <w:r>
+        <w:rPr>
+          <w:rFonts w:cstheme="minorHAnsi"/>
+        </w:rPr>
+        <w:t>ksMac</w:t>
+      </w:r>
+      <w:proofErr w:type="spellEnd"/>
+      <w:r>
+        <w:rPr>
+          <w:rFonts w:cstheme="minorHAnsi"/>
+        </w:rPr>
+        <w:t>) and SSC; all APDUs encrypted with 3DES + ISO 9797-1 MAC.</w:t>
       </w:r>
     </w:p>
     <w:p>
@@ -16308,14 +16282,14 @@
       </w:pPr>
       <w:r>
         <w:rPr>
-          <w:rFonts w:cstheme="minorHAnsi"/>
           <w:noProof/>
         </w:rPr>
+        <w:lastRenderedPageBreak/>
         <w:drawing>
-          <wp:inline distT="0" distB="0" distL="0" distR="0" wp14:anchorId="7B3528F4" wp14:editId="45AE1043">
-            <wp:extent cx="3988083" cy="4710896"/>
+          <wp:inline distT="0" distB="0" distL="0" distR="0" wp14:anchorId="37BEFEC9" wp14:editId="2BDF1CFA">
+            <wp:extent cx="3987687" cy="5494351"/>
             <wp:effectExtent l="0" t="0" r="0" b="0"/>
-            <wp:docPr id="1910402963" name="Picture 8"/>
+            <wp:docPr id="1331961071" name="Picture 5"/>
             <wp:cNvGraphicFramePr>
               <a:graphicFrameLocks xmlns:a="http://schemas.openxmlformats.org/drawingml/2006/main" noChangeAspect="1"/>
             </wp:cNvGraphicFramePr>
@@ -16323,7 +16297,7 @@
               <a:graphicData uri="http://schemas.openxmlformats.org/drawingml/2006/picture">
                 <pic:pic xmlns:pic="http://schemas.openxmlformats.org/drawingml/2006/picture">
                   <pic:nvPicPr>
-                    <pic:cNvPr id="1910402963" name="Picture 1910402963"/>
+                    <pic:cNvPr id="1331961071" name="Picture 1331961071"/>
                     <pic:cNvPicPr/>
                   </pic:nvPicPr>
                   <pic:blipFill>
@@ -16341,7 +16315,7 @@
                   <pic:spPr>
                     <a:xfrm>
                       <a:off x="0" y="0"/>
-                      <a:ext cx="3997108" cy="4721557"/>
+                      <a:ext cx="4006360" cy="5520080"/>
                     </a:xfrm>
                     <a:prstGeom prst="rect">
                       <a:avLst/>
@@ -16357,9 +16331,6 @@
     <w:p>
       <w:pPr>
         <w:pStyle w:val="Caption"/>
-        <w:rPr>
-          <w:rFonts w:cstheme="minorHAnsi"/>
-        </w:rPr>
       </w:pPr>
       <w:r>
         <w:t xml:space="preserve">Figure </w:t>
@@ -16376,7 +16347,18 @@
         <w:t xml:space="preserve"> </w:t>
       </w:r>
       <w:r>
-        <w:t>shows the Passport Data screen displaying the successfully extracted DG1 personal fields and the DG2 face image extracted from the chip</w:t>
+        <w:t>shows the NFC Read screen with completed stages visible</w:t>
+      </w:r>
+    </w:p>
+    <w:p>
+      <w:pPr>
+        <w:pStyle w:val="Caption"/>
+        <w:rPr>
+          <w:rFonts w:cstheme="minorHAnsi"/>
+        </w:rPr>
+      </w:pPr>
+      <w:r>
+        <w:t>.</w:t>
       </w:r>
     </w:p>
     <w:p>
@@ -16391,13 +16373,49 @@
           <w:bCs w:val="0"/>
         </w:rPr>
       </w:pPr>
-      <w:bookmarkStart w:id="107" w:name="_Toc223028202"/>
+      <w:bookmarkStart w:id="106" w:name="_Toc223028201"/>
       <w:r>
         <w:rPr>
           <w:b w:val="0"/>
           <w:bCs w:val="0"/>
         </w:rPr>
-        <w:t>Step 6 — Verification (Passive Authentication)</w:t>
+        <w:t>Data Extraction (DG1, DG2, SOD)</w:t>
+      </w:r>
+      <w:bookmarkEnd w:id="106"/>
+    </w:p>
+    <w:p>
+      <w:pPr>
+        <w:spacing w:line="240" w:lineRule="auto"/>
+        <w:rPr>
+          <w:rFonts w:cstheme="minorHAnsi"/>
+        </w:rPr>
+      </w:pPr>
+      <w:r>
+        <w:rPr>
+          <w:rFonts w:cstheme="minorHAnsi"/>
+        </w:rPr>
+        <w:t>After the secure session is established, the application reads four data groups from the chip over the encrypted channel: DG1 (Personal Data), DG2 (Face Image), DG14 (Chip Authentication SecurityInfos), and SOD (Security Object Document), using 224-byte chunks via sequential READ BINARY APDU commands.</w:t>
+      </w:r>
+    </w:p>
+    <w:p>
+      <w:pPr>
+        <w:pStyle w:val="Heading3"/>
+        <w:numPr>
+          <w:ilvl w:val="2"/>
+          <w:numId w:val="44"/>
+        </w:numPr>
+        <w:rPr>
+          <w:b w:val="0"/>
+          <w:bCs w:val="0"/>
+        </w:rPr>
+      </w:pPr>
+      <w:bookmarkStart w:id="107" w:name="_Toc223028202"/>
+      <w:r>
+        <w:rPr>
+          <w:b w:val="0"/>
+          <w:bCs w:val="0"/>
+        </w:rPr>
+        <w:t>Verification (Passive Authentication)</w:t>
       </w:r>
       <w:bookmarkEnd w:id="107"/>
     </w:p>
@@ -16412,35 +16430,7 @@
         <w:rPr>
           <w:rFonts w:cstheme="minorHAnsi"/>
         </w:rPr>
-        <w:t xml:space="preserve">After extracting </w:t>
-      </w:r>
-      <w:r>
-        <w:rPr>
-          <w:rFonts w:cstheme="minorHAnsi"/>
-          <w:b/>
-          <w:bCs/>
-        </w:rPr>
-        <w:t>DG1</w:t>
-      </w:r>
-      <w:r>
-        <w:rPr>
-          <w:rFonts w:cstheme="minorHAnsi"/>
-        </w:rPr>
-        <w:t xml:space="preserve"> and </w:t>
-      </w:r>
-      <w:r>
-        <w:rPr>
-          <w:rFonts w:cstheme="minorHAnsi"/>
-          <w:b/>
-          <w:bCs/>
-        </w:rPr>
-        <w:t>DG2</w:t>
-      </w:r>
-      <w:r>
-        <w:rPr>
-          <w:rFonts w:cstheme="minorHAnsi"/>
-        </w:rPr>
-        <w:t>, the app performs two verification checks.</w:t>
+        <w:t>After extracting DG1 and DG2, the app performs three verification checks.</w:t>
       </w:r>
     </w:p>
     <w:p>
@@ -16480,21 +16470,7 @@
         <w:rPr>
           <w:rFonts w:cstheme="minorHAnsi"/>
         </w:rPr>
-        <w:t xml:space="preserve">Compute </w:t>
-      </w:r>
-      <w:r>
-        <w:rPr>
-          <w:rFonts w:cstheme="minorHAnsi"/>
-          <w:b/>
-          <w:bCs/>
-        </w:rPr>
-        <w:t>SHA-256 hashes</w:t>
-      </w:r>
-      <w:r>
-        <w:rPr>
-          <w:rFonts w:cstheme="minorHAnsi"/>
-        </w:rPr>
-        <w:t xml:space="preserve"> of DG1 and DG2 (as read from the chip).</w:t>
+        <w:t>Auto-detect hash algorithm from SOD OID (SHA-1, SHA-256, SHA-384, or SHA-512); compute hash of raw DG1 and DG2 bytes read from chip.</w:t>
       </w:r>
     </w:p>
     <w:p>
@@ -16546,6 +16522,7 @@
         <w:rPr>
           <w:rFonts w:cstheme="minorHAnsi"/>
         </w:rPr>
+        <w:lastRenderedPageBreak/>
         <w:t>If they match → data has not been altered since issuance.</w:t>
       </w:r>
     </w:p>
@@ -16623,25 +16600,7 @@
         <w:rPr>
           <w:rFonts w:cstheme="minorHAnsi"/>
         </w:rPr>
-        <w:t xml:space="preserve">Perform structural validation of the </w:t>
-      </w:r>
-      <w:r>
-        <w:rPr>
-          <w:rFonts w:cstheme="minorHAnsi"/>
-        </w:rPr>
-        <w:t>SOD Signed</w:t>
-      </w:r>
-      <w:r>
-        <w:rPr>
-          <w:rFonts w:cstheme="minorHAnsi"/>
-        </w:rPr>
-        <w:t xml:space="preserve"> </w:t>
-      </w:r>
-      <w:r>
-        <w:rPr>
-          <w:rFonts w:cstheme="minorHAnsi"/>
-        </w:rPr>
-        <w:t>Data format.</w:t>
+        <w:t>Parse full ASN.1/CMS SignedData; decode LDSSecurityObject to extract hash algorithm OID and DataGroupHashValues for each data group.</w:t>
       </w:r>
     </w:p>
     <w:p>
@@ -16677,6 +16636,119 @@
     </w:p>
     <w:p>
       <w:pPr>
+        <w:pStyle w:val="ListParagraph"/>
+        <w:numPr>
+          <w:ilvl w:val="1"/>
+          <w:numId w:val="43"/>
+        </w:numPr>
+        <w:spacing w:line="240" w:lineRule="auto"/>
+        <w:rPr>
+          <w:rFonts w:cstheme="minorHAnsi"/>
+        </w:rPr>
+      </w:pPr>
+      <w:r>
+        <w:rPr>
+          <w:rFonts w:cstheme="minorHAnsi"/>
+          <w:b/>
+          <w:bCs/>
+        </w:rPr>
+        <w:t>Chip Authentication (CA)</w:t>
+      </w:r>
+    </w:p>
+    <w:p>
+      <w:pPr>
+        <w:pStyle w:val="ListParagraph"/>
+        <w:numPr>
+          <w:ilvl w:val="0"/>
+          <w:numId w:val="89"/>
+        </w:numPr>
+        <w:spacing w:line="240" w:lineRule="auto"/>
+        <w:rPr>
+          <w:rFonts w:cstheme="minorHAnsi"/>
+        </w:rPr>
+      </w:pPr>
+      <w:r>
+        <w:rPr>
+          <w:rFonts w:cstheme="minorHAnsi"/>
+        </w:rPr>
+        <w:t>Result: N/A — EC public key stored in EF.CardSecurity on this passport; requires PACE (not available via BAC).</w:t>
+      </w:r>
+    </w:p>
+    <w:p>
+      <w:pPr>
+        <w:pStyle w:val="ListParagraph"/>
+        <w:numPr>
+          <w:ilvl w:val="0"/>
+          <w:numId w:val="89"/>
+        </w:numPr>
+        <w:spacing w:line="240" w:lineRule="auto"/>
+        <w:rPr>
+          <w:rFonts w:cstheme="minorHAnsi"/>
+        </w:rPr>
+      </w:pPr>
+      <w:r>
+        <w:rPr>
+          <w:rFonts w:cstheme="minorHAnsi"/>
+        </w:rPr>
+        <w:t>If the chip returns SW 9000, it holds the genuine EC private key → chip is authentic and not cloned.</w:t>
+      </w:r>
+    </w:p>
+    <w:p>
+      <w:pPr>
+        <w:pStyle w:val="ListParagraph"/>
+        <w:numPr>
+          <w:ilvl w:val="0"/>
+          <w:numId w:val="89"/>
+        </w:numPr>
+        <w:spacing w:line="240" w:lineRule="auto"/>
+        <w:rPr>
+          <w:rFonts w:cstheme="minorHAnsi"/>
+        </w:rPr>
+      </w:pPr>
+      <w:r>
+        <w:rPr>
+          <w:rFonts w:cstheme="minorHAnsi"/>
+        </w:rPr>
+        <w:t>Generate an ephemeral ECDH key pair; send GENERAL AUTHENTICATE with the ephemeral public key over Secure Messaging.</w:t>
+      </w:r>
+    </w:p>
+    <w:p>
+      <w:pPr>
+        <w:pStyle w:val="ListParagraph"/>
+        <w:numPr>
+          <w:ilvl w:val="0"/>
+          <w:numId w:val="89"/>
+        </w:numPr>
+        <w:spacing w:line="240" w:lineRule="auto"/>
+        <w:rPr>
+          <w:rFonts w:cstheme="minorHAnsi"/>
+        </w:rPr>
+      </w:pPr>
+      <w:r>
+        <w:rPr>
+          <w:rFonts w:cstheme="minorHAnsi"/>
+        </w:rPr>
+        <w:t>Read DG14 (SecurityInfos) and parse the chip’s EC public key from SubjectPublicKeyInfo BIT STRING (uncompressed point, 04 prefix).</w:t>
+      </w:r>
+    </w:p>
+    <w:p>
+      <w:pPr>
+        <w:spacing w:line="240" w:lineRule="auto"/>
+        <w:rPr>
+          <w:rFonts w:cstheme="minorHAnsi"/>
+        </w:rPr>
+        <w:sectPr>
+          <w:type w:val="continuous"/>
+          <w:pgSz w:w="11906" w:h="16838" w:code="9"/>
+          <w:pgMar w:top="1440" w:right="1440" w:bottom="1440" w:left="1440" w:header="720" w:footer="720" w:gutter="0"/>
+          <w:cols w:space="720"/>
+          <w:titlePg/>
+          <w:docGrid w:linePitch="360"/>
+        </w:sectPr>
+      </w:pPr>
+    </w:p>
+    <w:p>
+      <w:pPr>
         <w:spacing w:line="240" w:lineRule="auto"/>
         <w:rPr>
           <w:rFonts w:cstheme="minorHAnsi"/>
@@ -16698,12 +16770,11 @@
         <w:rPr>
           <w:noProof/>
         </w:rPr>
-        <w:lastRenderedPageBreak/>
         <w:drawing>
-          <wp:inline distT="0" distB="0" distL="0" distR="0" wp14:anchorId="3011D136" wp14:editId="37B213CA">
-            <wp:extent cx="3989705" cy="6137492"/>
-            <wp:effectExtent l="0" t="0" r="0" b="0"/>
-            <wp:docPr id="741376655" name="Picture 9"/>
+          <wp:inline distT="0" distB="0" distL="0" distR="0" wp14:anchorId="27D8671A" wp14:editId="60F03E27">
+            <wp:extent cx="2933615" cy="4958107"/>
+            <wp:effectExtent l="0" t="0" r="635" b="0"/>
+            <wp:docPr id="903462184" name="Picture 4"/>
             <wp:cNvGraphicFramePr>
               <a:graphicFrameLocks xmlns:a="http://schemas.openxmlformats.org/drawingml/2006/main" noChangeAspect="1"/>
             </wp:cNvGraphicFramePr>
@@ -16711,10 +16782,8 @@
               <a:graphicData uri="http://schemas.openxmlformats.org/drawingml/2006/picture">
                 <pic:pic xmlns:pic="http://schemas.openxmlformats.org/drawingml/2006/picture">
                   <pic:nvPicPr>
-                    <pic:cNvPr id="0" name="Picture 2"/>
-                    <pic:cNvPicPr>
-                      <a:picLocks noChangeAspect="1" noChangeArrowheads="1"/>
-                    </pic:cNvPicPr>
+                    <pic:cNvPr id="903462184" name="Picture 903462184"/>
+                    <pic:cNvPicPr/>
                   </pic:nvPicPr>
                   <pic:blipFill>
                     <a:blip r:embed="rId22" cstate="print">
@@ -16724,23 +16793,18 @@
                         </a:ext>
                       </a:extLst>
                     </a:blip>
-                    <a:srcRect/>
                     <a:stretch>
                       <a:fillRect/>
                     </a:stretch>
                   </pic:blipFill>
-                  <pic:spPr bwMode="auto">
+                  <pic:spPr>
                     <a:xfrm>
                       <a:off x="0" y="0"/>
-                      <a:ext cx="3995531" cy="6146454"/>
+                      <a:ext cx="2947740" cy="4981979"/>
                     </a:xfrm>
                     <a:prstGeom prst="rect">
                       <a:avLst/>
                     </a:prstGeom>
-                    <a:noFill/>
-                    <a:ln>
-                      <a:noFill/>
-                    </a:ln>
                   </pic:spPr>
                 </pic:pic>
               </a:graphicData>
@@ -16752,9 +16816,6 @@
     <w:p>
       <w:pPr>
         <w:pStyle w:val="Caption"/>
-        <w:rPr>
-          <w:rFonts w:cstheme="minorHAnsi"/>
-        </w:rPr>
       </w:pPr>
       <w:r>
         <w:t xml:space="preserve">Figure </w:t>
@@ -16771,8 +16832,113 @@
         <w:t xml:space="preserve"> </w:t>
       </w:r>
       <w:r>
-        <w:t>shows the results screen with DG1, DG2, and SOD all marked as PASS, alongside the complete audit log with timestamps confirming each stage of the session</w:t>
-      </w:r>
+        <w:t>shows the results screen with DG</w:t>
+      </w:r>
+      <w:r>
+        <w:t>1 (personal information)</w:t>
+      </w:r>
+    </w:p>
+    <w:p>
+      <w:pPr>
+        <w:keepNext/>
+        <w:spacing w:line="240" w:lineRule="auto"/>
+      </w:pPr>
+      <w:r>
+        <w:t xml:space="preserve"> </w:t>
+      </w:r>
+      <w:r>
+        <w:rPr>
+          <w:noProof/>
+        </w:rPr>
+        <w:drawing>
+          <wp:inline distT="0" distB="0" distL="0" distR="0" wp14:anchorId="72847574" wp14:editId="582D67B4">
+            <wp:extent cx="2758440" cy="4976077"/>
+            <wp:effectExtent l="0" t="0" r="3810" b="0"/>
+            <wp:docPr id="1223325917" name="Picture 3"/>
+            <wp:cNvGraphicFramePr>
+              <a:graphicFrameLocks xmlns:a="http://schemas.openxmlformats.org/drawingml/2006/main" noChangeAspect="1"/>
+            </wp:cNvGraphicFramePr>
+            <a:graphic xmlns:a="http://schemas.openxmlformats.org/drawingml/2006/main">
+              <a:graphicData uri="http://schemas.openxmlformats.org/drawingml/2006/picture">
+                <pic:pic xmlns:pic="http://schemas.openxmlformats.org/drawingml/2006/picture">
+                  <pic:nvPicPr>
+                    <pic:cNvPr id="1223325917" name="Picture 1223325917"/>
+                    <pic:cNvPicPr/>
+                  </pic:nvPicPr>
+                  <pic:blipFill>
+                    <a:blip r:embed="rId23" cstate="print">
+                      <a:extLst>
+                        <a:ext uri="{28A0092B-C50C-407E-A947-70E740481C1C}">
+                          <a14:useLocalDpi xmlns:a14="http://schemas.microsoft.com/office/drawing/2010/main" val="0"/>
+                        </a:ext>
+                      </a:extLst>
+                    </a:blip>
+                    <a:stretch>
+                      <a:fillRect/>
+                    </a:stretch>
+                  </pic:blipFill>
+                  <pic:spPr>
+                    <a:xfrm>
+                      <a:off x="0" y="0"/>
+                      <a:ext cx="2782915" cy="5020228"/>
+                    </a:xfrm>
+                    <a:prstGeom prst="rect">
+                      <a:avLst/>
+                    </a:prstGeom>
+                  </pic:spPr>
+                </pic:pic>
+              </a:graphicData>
+            </a:graphic>
+          </wp:inline>
+        </w:drawing>
+      </w:r>
+    </w:p>
+    <w:p>
+      <w:pPr>
+        <w:pStyle w:val="Caption"/>
+      </w:pPr>
+      <w:r>
+        <w:t xml:space="preserve">Figure </w:t>
+      </w:r>
+      <w:fldSimple w:instr=" SEQ Figure \* ARABIC ">
+        <w:r>
+          <w:rPr>
+            <w:noProof/>
+          </w:rPr>
+          <w:t>8</w:t>
+        </w:r>
+      </w:fldSimple>
+      <w:r>
+        <w:t xml:space="preserve"> </w:t>
+      </w:r>
+      <w:r>
+        <w:t xml:space="preserve"> shows the results screen with DG2</w:t>
+      </w:r>
+      <w:r>
+        <w:t xml:space="preserve"> and security status </w:t>
+      </w:r>
+    </w:p>
+    <w:p>
+      <w:pPr>
+        <w:keepNext/>
+        <w:spacing w:line="240" w:lineRule="auto"/>
+        <w:sectPr>
+          <w:type w:val="continuous"/>
+          <w:pgSz w:w="11906" w:h="16838" w:code="9"/>
+          <w:pgMar w:top="1440" w:right="1440" w:bottom="1440" w:left="1440" w:header="720" w:footer="720" w:gutter="0"/>
+          <w:cols w:num="2" w:space="720"/>
+          <w:titlePg/>
+          <w:docGrid w:linePitch="360"/>
+        </w:sectPr>
+      </w:pPr>
+    </w:p>
+    <w:p>
+      <w:pPr>
+        <w:pStyle w:val="Caption"/>
+        <w:rPr>
+          <w:rFonts w:cstheme="minorHAnsi"/>
+        </w:rPr>
+      </w:pPr>
     </w:p>
     <w:p>
       <w:pPr>
@@ -16809,14 +16975,12 @@
         </w:rPr>
         <w:t xml:space="preserve">The table below </w:t>
       </w:r>
-      <w:proofErr w:type="spellStart"/>
       <w:r>
         <w:rPr>
           <w:rFonts w:cstheme="minorHAnsi"/>
         </w:rPr>
-        <w:t>summarises</w:t>
-      </w:r>
-      <w:proofErr w:type="spellEnd"/>
+        <w:t>summarizes</w:t>
+      </w:r>
       <w:r>
         <w:rPr>
           <w:rFonts w:cstheme="minorHAnsi"/>
@@ -16840,8 +17004,8 @@
         <w:tblLook w:val="04A0" w:firstRow="1" w:lastRow="0" w:firstColumn="1" w:lastColumn="0" w:noHBand="0" w:noVBand="1"/>
       </w:tblPr>
       <w:tblGrid>
+        <w:gridCol w:w="4512"/>
         <w:gridCol w:w="4514"/>
-        <w:gridCol w:w="4512"/>
       </w:tblGrid>
       <w:tr>
         <w:trPr>
@@ -17100,7 +17264,6 @@
               <w:rPr>
                 <w:rFonts w:cstheme="minorHAnsi"/>
               </w:rPr>
-              <w:lastRenderedPageBreak/>
               <w:t>DG1 — Personal Data</w:t>
             </w:r>
           </w:p>
@@ -17300,7 +17463,7 @@
                 <w:rFonts w:cstheme="minorHAnsi"/>
                 <w:color w:val="C0392B"/>
               </w:rPr>
-              <w:t>Not implemented (requires ECDH)</w:t>
+              <w:t>N/A — ECDH implemented; EC key in EF.CardSecurity (requires PACE, not available via BAC)</w:t>
             </w:r>
           </w:p>
         </w:tc>
@@ -17342,7 +17505,7 @@
                 <w:rFonts w:cstheme="minorHAnsi"/>
                 <w:color w:val="E67E22"/>
               </w:rPr>
-              <w:t>Partial — structural check only</w:t>
+              <w:t>Partial — DG1/DG2 hash verified via ASN.1/CMS parsing; DSC/CSCA certificate chain not verified</w:t>
             </w:r>
           </w:p>
         </w:tc>
@@ -17360,7 +17523,7 @@
         <w:rPr>
           <w:rFonts w:cstheme="minorHAnsi"/>
         </w:rPr>
-        <w:t>The demonstration confirms that MRZ-derived keys can successfully unlock a Pakistani e-passport NFC chip, and that DG1 personal data, DG2 biometric facial image, and SOD digital signatures can all be extracted and verified using the ICAO 9303 BAC protocol on a standard NFC-enabled Android smartphone, without any</w:t>
+        <w:t>The demonstration confirms that MRZ-derived keys can successfully unlock a Pakistani e-passport NFC chip, and that DG1 personal data, DG2 biometric facial image, and SOD digital signatures can all be extracted and verified using the ICAO 9303 BAC protocol on a standard NFC-enabled Android smartphone, without any specialised hardware beyond an NFC-enabled Android smartphone, and without requiring proprietary software or government-issued certificates for core data extraction and passive authentication.</w:t>
       </w:r>
     </w:p>
     <w:sectPr>
@@ -17426,7 +17589,7 @@
           <wp:extent cx="1072989" cy="371888"/>
           <wp:effectExtent l="0" t="0" r="0" b="0"/>
           <wp:wrapNone/>
-          <wp:docPr id="1085195387" name="Picture 1085195387"/>
+          <wp:docPr id="863519313" name="Picture 863519313"/>
           <wp:cNvGraphicFramePr>
             <a:graphicFrameLocks xmlns:a="http://schemas.openxmlformats.org/drawingml/2006/main" noChangeAspect="1"/>
           </wp:cNvGraphicFramePr>

</xml_diff>